<commit_message>
Momento 3 y clase Personajes hereda de clase Nivel
</commit_message>
<xml_diff>
--- a/Momento1/Dragon Ball.docx
+++ b/Momento1/Dragon Ball.docx
@@ -39,7 +39,21 @@
           <w:rFonts w:ascii="Times New Roman" w:hAnsi="Times New Roman" w:cs="Times New Roman"/>
           <w:lang w:val="es-MX"/>
         </w:rPr>
-        <w:t xml:space="preserve">Este videojuego está inspirado en los capítulos 67 y 68 de Dragon Ball, este narra el momento en el que Goku se infiltra en la base principal del ejército Red Ribbon para detener sus maquiavélicos planes. Durante la misión, descubre la traición interna que hay dentro del ejército, termina enfrentando al nuevo comandante Black en una batalla épica, y finalmente logra recuperar seis esferas del Dragón, impidiendo que hagan un uso indebido con ellas. </w:t>
+        <w:t xml:space="preserve">Este videojuego está inspirado en los capítulos 67 y 68 de Dragon Ball, este narra el momento en el que Goku se infiltra en la base principal del ejército Red Ribbon para detener sus maquiavélicos planes. Durante la misión, descubre la traición interna que hay dentro del ejército, termina enfrentando al nuevo comandante Black en una batalla épica, y finalmente logra recuperar seis esferas del Dragón, impidiendo que hagan un uso indebido </w:t>
+      </w:r>
+      <w:r>
+        <w:rPr>
+          <w:rFonts w:ascii="Times New Roman" w:hAnsi="Times New Roman" w:cs="Times New Roman"/>
+          <w:lang w:val="es-MX"/>
+        </w:rPr>
+        <w:t>de</w:t>
+      </w:r>
+      <w:r>
+        <w:rPr>
+          <w:rFonts w:ascii="Times New Roman" w:hAnsi="Times New Roman" w:cs="Times New Roman"/>
+          <w:lang w:val="es-MX"/>
+        </w:rPr>
+        <w:t xml:space="preserve"> ellas. </w:t>
       </w:r>
     </w:p>
     <w:p>
@@ -1241,7 +1255,6 @@
           <w:rFonts w:ascii="Times New Roman" w:hAnsi="Times New Roman" w:cs="Times New Roman"/>
           <w:i/>
           <w:iCs/>
-          <w:lang w:val="es-MX"/>
         </w:rPr>
       </w:pPr>
       <w:r>
@@ -1284,6 +1297,250 @@
         </w:rPr>
         <w:t xml:space="preserve"> movimiento oscilatorio en dos dimensiones para las torretas.</w:t>
       </w:r>
+    </w:p>
+    <w:p>
+      <w:pPr>
+        <w:jc w:val="both"/>
+        <w:rPr>
+          <w:rFonts w:ascii="Times New Roman" w:hAnsi="Times New Roman" w:cs="Times New Roman"/>
+          <w:i/>
+          <w:iCs/>
+        </w:rPr>
+      </w:pPr>
+    </w:p>
+    <w:p>
+      <w:pPr>
+        <w:jc w:val="both"/>
+        <w:rPr>
+          <w:rFonts w:ascii="Times New Roman" w:hAnsi="Times New Roman" w:cs="Times New Roman"/>
+          <w:i/>
+          <w:iCs/>
+        </w:rPr>
+      </w:pPr>
+    </w:p>
+    <w:p>
+      <w:pPr>
+        <w:jc w:val="both"/>
+        <w:rPr>
+          <w:rFonts w:ascii="Times New Roman" w:hAnsi="Times New Roman" w:cs="Times New Roman"/>
+          <w:i/>
+          <w:iCs/>
+          <w:lang w:val="es-MX"/>
+        </w:rPr>
+      </w:pPr>
+      <w:r>
+        <w:rPr>
+          <w:rFonts w:ascii="Times New Roman" w:hAnsi="Times New Roman" w:cs="Times New Roman"/>
+          <w:i/>
+          <w:iCs/>
+          <w:lang w:val="es-MX"/>
+        </w:rPr>
+        <w:lastRenderedPageBreak/>
+        <w:t>Cambio</w:t>
+      </w:r>
+      <w:r>
+        <w:rPr>
+          <w:rFonts w:ascii="Times New Roman" w:hAnsi="Times New Roman" w:cs="Times New Roman"/>
+          <w:i/>
+          <w:iCs/>
+          <w:lang w:val="es-MX"/>
+        </w:rPr>
+        <w:t>s</w:t>
+      </w:r>
+      <w:r>
+        <w:rPr>
+          <w:rFonts w:ascii="Times New Roman" w:hAnsi="Times New Roman" w:cs="Times New Roman"/>
+          <w:i/>
+          <w:iCs/>
+          <w:lang w:val="es-MX"/>
+        </w:rPr>
+        <w:t xml:space="preserve"> de Nivel 1:</w:t>
+      </w:r>
+    </w:p>
+    <w:p>
+      <w:pPr>
+        <w:jc w:val="both"/>
+        <w:rPr>
+          <w:rFonts w:ascii="Times New Roman" w:hAnsi="Times New Roman" w:cs="Times New Roman"/>
+          <w:i/>
+          <w:iCs/>
+          <w:lang w:val="es-MX"/>
+        </w:rPr>
+      </w:pPr>
+      <w:r>
+        <w:rPr>
+          <w:rFonts w:ascii="Times New Roman" w:hAnsi="Times New Roman" w:cs="Times New Roman"/>
+          <w:i/>
+          <w:iCs/>
+          <w:lang w:val="es-MX"/>
+        </w:rPr>
+        <w:t xml:space="preserve">Goku se encuentra en la entrada principal a la base en la cual hay tres entradas. A la derecha hay  x </w:t>
+      </w:r>
+      <w:r>
+        <w:rPr>
+          <w:rFonts w:ascii="Times New Roman" w:hAnsi="Times New Roman" w:cs="Times New Roman"/>
+          <w:i/>
+          <w:iCs/>
+          <w:lang w:val="es-MX"/>
+        </w:rPr>
+        <w:t>soldados</w:t>
+      </w:r>
+      <w:r>
+        <w:rPr>
+          <w:rFonts w:ascii="Times New Roman" w:hAnsi="Times New Roman" w:cs="Times New Roman"/>
+          <w:i/>
+          <w:iCs/>
+          <w:lang w:val="es-MX"/>
+        </w:rPr>
+        <w:t xml:space="preserve"> que disparan bolas de fuego, ellos protegen la entrada a la base, al igual que a la izquierda hay x </w:t>
+      </w:r>
+      <w:r>
+        <w:rPr>
+          <w:rFonts w:ascii="Times New Roman" w:hAnsi="Times New Roman" w:cs="Times New Roman"/>
+          <w:i/>
+          <w:iCs/>
+          <w:lang w:val="es-MX"/>
+        </w:rPr>
+        <w:t>soldados</w:t>
+      </w:r>
+      <w:r>
+        <w:rPr>
+          <w:rFonts w:ascii="Times New Roman" w:hAnsi="Times New Roman" w:cs="Times New Roman"/>
+          <w:i/>
+          <w:iCs/>
+          <w:lang w:val="es-MX"/>
+        </w:rPr>
+        <w:t xml:space="preserve"> que protegen </w:t>
+      </w:r>
+      <w:r>
+        <w:rPr>
+          <w:rFonts w:ascii="Times New Roman" w:hAnsi="Times New Roman" w:cs="Times New Roman"/>
+          <w:i/>
+          <w:iCs/>
+          <w:lang w:val="es-MX"/>
+        </w:rPr>
+        <w:t xml:space="preserve">también la </w:t>
+      </w:r>
+      <w:r>
+        <w:rPr>
+          <w:rFonts w:ascii="Times New Roman" w:hAnsi="Times New Roman" w:cs="Times New Roman"/>
+          <w:i/>
+          <w:iCs/>
+          <w:lang w:val="es-MX"/>
+        </w:rPr>
+        <w:t>base y en el centro siendo la más directa hay 4 torres que lanzan bolas de fuego en diferentes direcciones</w:t>
+      </w:r>
+      <w:r>
+        <w:rPr>
+          <w:rFonts w:ascii="Times New Roman" w:hAnsi="Times New Roman" w:cs="Times New Roman"/>
+          <w:i/>
+          <w:iCs/>
+          <w:lang w:val="es-MX"/>
+        </w:rPr>
+        <w:t>,</w:t>
+      </w:r>
+      <w:r>
+        <w:rPr>
+          <w:rFonts w:ascii="Times New Roman" w:hAnsi="Times New Roman" w:cs="Times New Roman"/>
+          <w:i/>
+          <w:iCs/>
+          <w:lang w:val="es-MX"/>
+        </w:rPr>
+        <w:t xml:space="preserve"> unas hacia la entrada y otras hacia la puerta.</w:t>
+      </w:r>
+      <w:r>
+        <w:rPr>
+          <w:rFonts w:ascii="Times New Roman" w:hAnsi="Times New Roman" w:cs="Times New Roman"/>
+          <w:i/>
+          <w:iCs/>
+          <w:lang w:val="es-MX"/>
+        </w:rPr>
+        <w:br/>
+        <w:t>Si Goku entra por el frente debe esquivar las bolas de fuego e irle pegando a la puerta para derribarl</w:t>
+      </w:r>
+      <w:r>
+        <w:rPr>
+          <w:rFonts w:ascii="Times New Roman" w:hAnsi="Times New Roman" w:cs="Times New Roman"/>
+          <w:i/>
+          <w:iCs/>
+          <w:lang w:val="es-MX"/>
+        </w:rPr>
+        <w:t>a</w:t>
+      </w:r>
+      <w:r>
+        <w:rPr>
+          <w:rFonts w:ascii="Times New Roman" w:hAnsi="Times New Roman" w:cs="Times New Roman"/>
+          <w:i/>
+          <w:iCs/>
+          <w:lang w:val="es-MX"/>
+        </w:rPr>
+        <w:t>, Si logra derribarl</w:t>
+      </w:r>
+      <w:r>
+        <w:rPr>
+          <w:rFonts w:ascii="Times New Roman" w:hAnsi="Times New Roman" w:cs="Times New Roman"/>
+          <w:i/>
+          <w:iCs/>
+          <w:lang w:val="es-MX"/>
+        </w:rPr>
+        <w:t>a</w:t>
+      </w:r>
+      <w:r>
+        <w:rPr>
+          <w:rFonts w:ascii="Times New Roman" w:hAnsi="Times New Roman" w:cs="Times New Roman"/>
+          <w:i/>
+          <w:iCs/>
+          <w:lang w:val="es-MX"/>
+        </w:rPr>
+        <w:t xml:space="preserve"> tiene que acabar con los otros soldados y con las torretas  para pasar al nivel 2. Si Goku recibe un impacto pierde x energía</w:t>
+      </w:r>
+      <w:r>
+        <w:rPr>
+          <w:rFonts w:ascii="Times New Roman" w:hAnsi="Times New Roman" w:cs="Times New Roman"/>
+          <w:i/>
+          <w:iCs/>
+          <w:lang w:val="es-MX"/>
+        </w:rPr>
+        <w:t>,</w:t>
+      </w:r>
+      <w:r>
+        <w:rPr>
+          <w:rFonts w:ascii="Times New Roman" w:hAnsi="Times New Roman" w:cs="Times New Roman"/>
+          <w:i/>
+          <w:iCs/>
+          <w:lang w:val="es-MX"/>
+        </w:rPr>
+        <w:t xml:space="preserve"> si </w:t>
+      </w:r>
+      <w:r>
+        <w:rPr>
+          <w:rFonts w:ascii="Times New Roman" w:hAnsi="Times New Roman" w:cs="Times New Roman"/>
+          <w:i/>
+          <w:iCs/>
+          <w:lang w:val="es-MX"/>
+        </w:rPr>
+        <w:t xml:space="preserve">la energía </w:t>
+      </w:r>
+      <w:r>
+        <w:rPr>
+          <w:rFonts w:ascii="Times New Roman" w:hAnsi="Times New Roman" w:cs="Times New Roman"/>
+          <w:i/>
+          <w:iCs/>
+          <w:lang w:val="es-MX"/>
+        </w:rPr>
+        <w:t xml:space="preserve">llega a cero muere, Goku solo tiene 2 corazones que tienen de energía 100, con esa energía debe ganar el nivel. </w:t>
+      </w:r>
+    </w:p>
+    <w:p>
+      <w:pPr>
+        <w:jc w:val="both"/>
+        <w:rPr>
+          <w:rFonts w:ascii="Times New Roman" w:hAnsi="Times New Roman" w:cs="Times New Roman"/>
+          <w:i/>
+          <w:iCs/>
+          <w:lang w:val="es-MX"/>
+        </w:rPr>
+      </w:pPr>
     </w:p>
     <w:p>
       <w:pPr>

</xml_diff>